<commit_message>
final version, project is done
</commit_message>
<xml_diff>
--- a/бумаги2/Пояснительная_записка_Херунцева.docx
+++ b/бумаги2/Пояснительная_записка_Херунцева.docx
@@ -5792,7 +5792,6 @@
     <w:p>
       <w:pPr>
         <w:pStyle w:val="2"/>
-        <w:outlineLvl w:val="2"/>
         <w:rPr>
           <w:lang w:val="ru-RU"/>
         </w:rPr>
@@ -5980,7 +5979,15 @@
         </w:numPr>
       </w:pPr>
       <w:r>
-        <w:t xml:space="preserve">автоматическое создание карточек с контекстом для запоминания слов; система отслеживания статистики по изученным словам и времени занятий; </w:t>
+        <w:t xml:space="preserve">автоматическое создание карточек с контекстом для запоминания слов; система отслеживания </w:t>
+      </w:r>
+      <w:proofErr w:type="gramStart"/>
+      <w:r>
+        <w:t>статистики по изученным словам</w:t>
+      </w:r>
+      <w:proofErr w:type="gramEnd"/>
+      <w:r>
+        <w:t xml:space="preserve"> и времени занятий; </w:t>
       </w:r>
     </w:p>
     <w:p>
@@ -6092,13 +6099,13 @@
     <w:p>
       <w:pPr>
         <w:pStyle w:val="2"/>
-        <w:outlineLvl w:val="2"/>
       </w:pPr>
       <w:bookmarkStart w:id="7" w:name="_Toc228265522"/>
       <w:r>
         <w:lastRenderedPageBreak/>
         <w:t>Web-</w:t>
       </w:r>
+      <w:proofErr w:type="gramStart"/>
       <w:r>
         <w:rPr>
           <w:lang w:val="ru-RU"/>
@@ -6112,6 +6119,7 @@
         <w:t xml:space="preserve"> «</w:t>
       </w:r>
       <w:proofErr w:type="spellStart"/>
+      <w:proofErr w:type="gramEnd"/>
       <w:r>
         <w:t>Sottaku</w:t>
       </w:r>
@@ -6134,7 +6142,15 @@
       </w:r>
       <w:proofErr w:type="spellEnd"/>
       <w:r>
-        <w:t xml:space="preserve"> – это веб-приложение и мобильная платформа для изучения иностранных языков, построенная вокруг системы интервального повторения и ориентированная прежде всего на китайский, японский, корейский и английский языки . Основной принцип работы заключается в том, что пользователь изучает грамматику, проходит адаптивные тесты и читает тексты, разбитые по уровням сложности, при этом незнакомые слова автоматически сохраняются во </w:t>
+        <w:t xml:space="preserve"> – это веб-приложение и мобильная платформа для изучения иностранных языков, построенная вокруг системы интервального повторения и ориентированная прежде всего на китайский, японский, корейский и английский </w:t>
+      </w:r>
+      <w:proofErr w:type="gramStart"/>
+      <w:r>
+        <w:t>языки .</w:t>
+      </w:r>
+      <w:proofErr w:type="gramEnd"/>
+      <w:r>
+        <w:t xml:space="preserve"> Основной принцип работы заключается в том, что пользователь изучает грамматику, проходит адаптивные тесты и читает тексты, разбитые по уровням сложности, при этом незнакомые слова автоматически сохраняются во </w:t>
       </w:r>
       <w:proofErr w:type="spellStart"/>
       <w:r>
@@ -6142,7 +6158,15 @@
       </w:r>
       <w:proofErr w:type="spellEnd"/>
       <w:r>
-        <w:t xml:space="preserve">-карточки для последующего повторения по алгоритму FSRS . Такой подход часто приводит к тому, что пользователь перегружен количеством функций и настроек и тратит время не столько на чтение, сколько на освоение интерфейса. Интерфейс веб-сайта </w:t>
+        <w:t xml:space="preserve">-карточки для последующего повторения по алгоритму </w:t>
+      </w:r>
+      <w:proofErr w:type="gramStart"/>
+      <w:r>
+        <w:t>FSRS .</w:t>
+      </w:r>
+      <w:proofErr w:type="gramEnd"/>
+      <w:r>
+        <w:t xml:space="preserve"> Такой подход часто приводит к тому, что пользователь перегружен количеством функций и настроек и тратит время не столько на чтение, сколько на освоение интерфейса. Интерфейс веб-сайта </w:t>
       </w:r>
       <w:proofErr w:type="spellStart"/>
       <w:r>
@@ -6406,12 +6430,17 @@
         <w:t xml:space="preserve">нет функции одновременного чтения и прослушивания текста как в </w:t>
       </w:r>
       <w:proofErr w:type="spellStart"/>
+      <w:proofErr w:type="gramStart"/>
       <w:r>
         <w:t>LingQ</w:t>
       </w:r>
       <w:proofErr w:type="spellEnd"/>
       <w:r>
-        <w:t xml:space="preserve"> ; </w:t>
+        <w:t> ;</w:t>
+      </w:r>
+      <w:proofErr w:type="gramEnd"/>
+      <w:r>
+        <w:t xml:space="preserve"> </w:t>
       </w:r>
     </w:p>
     <w:p>
@@ -6928,7 +6957,23 @@
                 <w:sz w:val="24"/>
                 <w:szCs w:val="24"/>
               </w:rPr>
-              <w:t>добавлять отрывки и книги в избранное а также смотреть свою аналитику и отслеживать прогресс изученных правил.</w:t>
+              <w:t xml:space="preserve">добавлять отрывки и книги в </w:t>
+            </w:r>
+            <w:proofErr w:type="gramStart"/>
+            <w:r>
+              <w:rPr>
+                <w:sz w:val="24"/>
+                <w:szCs w:val="24"/>
+              </w:rPr>
+              <w:t>избранное</w:t>
+            </w:r>
+            <w:proofErr w:type="gramEnd"/>
+            <w:r>
+              <w:rPr>
+                <w:sz w:val="24"/>
+                <w:szCs w:val="24"/>
+              </w:rPr>
+              <w:t xml:space="preserve"> а также смотреть свою аналитику и отслеживать прогресс изученных правил.</w:t>
             </w:r>
           </w:p>
         </w:tc>
@@ -7639,7 +7684,25 @@
                 <w:sz w:val="24"/>
                 <w:szCs w:val="24"/>
               </w:rPr>
-              <w:t>цитат из книг по выбранному правилу с указанием названия книги, главы и страницы, а также кратким объяснением правила использованного в цитате</w:t>
+              <w:t xml:space="preserve">цитат из книг по выбранному правилу с указанием названия книги, главы и страницы, а также кратким объяснением </w:t>
+            </w:r>
+            <w:proofErr w:type="gramStart"/>
+            <w:r>
+              <w:rPr>
+                <w:color w:val="000000" w:themeColor="text1"/>
+                <w:sz w:val="24"/>
+                <w:szCs w:val="24"/>
+              </w:rPr>
+              <w:t>правила</w:t>
+            </w:r>
+            <w:proofErr w:type="gramEnd"/>
+            <w:r>
+              <w:rPr>
+                <w:color w:val="000000" w:themeColor="text1"/>
+                <w:sz w:val="24"/>
+                <w:szCs w:val="24"/>
+              </w:rPr>
+              <w:t xml:space="preserve"> использованного в цитате</w:t>
             </w:r>
           </w:p>
         </w:tc>
@@ -7733,8 +7796,18 @@
                 <w:sz w:val="24"/>
                 <w:szCs w:val="24"/>
               </w:rPr>
-              <w:t>Поиск отрывков из книг по ключевым словам</w:t>
-            </w:r>
+              <w:t xml:space="preserve">Поиск отрывков из </w:t>
+            </w:r>
+            <w:proofErr w:type="gramStart"/>
+            <w:r>
+              <w:rPr>
+                <w:color w:val="000000" w:themeColor="text1"/>
+                <w:sz w:val="24"/>
+                <w:szCs w:val="24"/>
+              </w:rPr>
+              <w:t>книг по ключевым словам</w:t>
+            </w:r>
+            <w:proofErr w:type="gramEnd"/>
           </w:p>
         </w:tc>
       </w:tr>
@@ -9414,6 +9487,7 @@
                 <w:szCs w:val="24"/>
               </w:rPr>
             </w:pPr>
+            <w:proofErr w:type="gramStart"/>
             <w:r>
               <w:rPr>
                 <w:color w:val="000000" w:themeColor="text1"/>
@@ -9422,6 +9496,7 @@
               </w:rPr>
               <w:t>VARCHAR(</w:t>
             </w:r>
+            <w:proofErr w:type="gramEnd"/>
             <w:r>
               <w:rPr>
                 <w:color w:val="000000" w:themeColor="text1"/>
@@ -9538,6 +9613,7 @@
                 <w:szCs w:val="24"/>
               </w:rPr>
             </w:pPr>
+            <w:proofErr w:type="gramStart"/>
             <w:r>
               <w:rPr>
                 <w:color w:val="000000" w:themeColor="text1"/>
@@ -9546,6 +9622,7 @@
               </w:rPr>
               <w:t>VARCHAR(</w:t>
             </w:r>
+            <w:proofErr w:type="gramEnd"/>
             <w:r>
               <w:rPr>
                 <w:color w:val="000000" w:themeColor="text1"/>
@@ -10024,13 +10101,23 @@
                 <w:szCs w:val="24"/>
               </w:rPr>
             </w:pPr>
-            <w:r>
-              <w:rPr>
-                <w:color w:val="000000" w:themeColor="text1"/>
-                <w:sz w:val="24"/>
-                <w:szCs w:val="24"/>
-              </w:rPr>
-              <w:t>VARCHAR(2</w:t>
+            <w:proofErr w:type="gramStart"/>
+            <w:r>
+              <w:rPr>
+                <w:color w:val="000000" w:themeColor="text1"/>
+                <w:sz w:val="24"/>
+                <w:szCs w:val="24"/>
+              </w:rPr>
+              <w:t>VARCHAR(</w:t>
+            </w:r>
+            <w:proofErr w:type="gramEnd"/>
+            <w:r>
+              <w:rPr>
+                <w:color w:val="000000" w:themeColor="text1"/>
+                <w:sz w:val="24"/>
+                <w:szCs w:val="24"/>
+              </w:rPr>
+              <w:t>2</w:t>
             </w:r>
             <w:r>
               <w:rPr>
@@ -10114,13 +10201,23 @@
                 <w:szCs w:val="24"/>
               </w:rPr>
             </w:pPr>
-            <w:r>
-              <w:rPr>
-                <w:color w:val="000000" w:themeColor="text1"/>
-                <w:sz w:val="24"/>
-                <w:szCs w:val="24"/>
-              </w:rPr>
-              <w:t>VARCHAR(2</w:t>
+            <w:proofErr w:type="gramStart"/>
+            <w:r>
+              <w:rPr>
+                <w:color w:val="000000" w:themeColor="text1"/>
+                <w:sz w:val="24"/>
+                <w:szCs w:val="24"/>
+              </w:rPr>
+              <w:t>VARCHAR(</w:t>
+            </w:r>
+            <w:proofErr w:type="gramEnd"/>
+            <w:r>
+              <w:rPr>
+                <w:color w:val="000000" w:themeColor="text1"/>
+                <w:sz w:val="24"/>
+                <w:szCs w:val="24"/>
+              </w:rPr>
+              <w:t>2</w:t>
             </w:r>
             <w:r>
               <w:rPr>
@@ -10379,8 +10476,13 @@
       <w:r>
         <w:t xml:space="preserve"> </w:t>
       </w:r>
-      <w:r>
-        <w:t>правила которые относятся к какой-либо категории</w:t>
+      <w:proofErr w:type="gramStart"/>
+      <w:r>
+        <w:t>правила</w:t>
+      </w:r>
+      <w:proofErr w:type="gramEnd"/>
+      <w:r>
+        <w:t xml:space="preserve"> которые относятся к какой-либо категории</w:t>
       </w:r>
       <w:r>
         <w:t xml:space="preserve">. Описание структуры </w:t>
@@ -10592,6 +10694,7 @@
                 <w:szCs w:val="24"/>
               </w:rPr>
             </w:pPr>
+            <w:proofErr w:type="gramStart"/>
             <w:r>
               <w:rPr>
                 <w:sz w:val="24"/>
@@ -10599,6 +10702,7 @@
               </w:rPr>
               <w:t>VARCHAR(</w:t>
             </w:r>
+            <w:proofErr w:type="gramEnd"/>
             <w:r>
               <w:rPr>
                 <w:sz w:val="24"/>
@@ -10776,6 +10880,7 @@
                 <w:szCs w:val="24"/>
               </w:rPr>
             </w:pPr>
+            <w:proofErr w:type="gramStart"/>
             <w:r>
               <w:rPr>
                 <w:sz w:val="24"/>
@@ -10783,6 +10888,7 @@
               </w:rPr>
               <w:t>VARCHAR(</w:t>
             </w:r>
+            <w:proofErr w:type="gramEnd"/>
             <w:r>
               <w:rPr>
                 <w:sz w:val="24"/>
@@ -11299,13 +11405,23 @@
                 <w:lang w:val="en-US"/>
               </w:rPr>
             </w:pPr>
+            <w:proofErr w:type="gramStart"/>
             <w:r>
               <w:rPr>
                 <w:sz w:val="24"/>
                 <w:szCs w:val="24"/>
                 <w:lang w:val="en-US"/>
               </w:rPr>
-              <w:t>VARCHAR(500)</w:t>
+              <w:t>VARCHAR(</w:t>
+            </w:r>
+            <w:proofErr w:type="gramEnd"/>
+            <w:r>
+              <w:rPr>
+                <w:sz w:val="24"/>
+                <w:szCs w:val="24"/>
+                <w:lang w:val="en-US"/>
+              </w:rPr>
+              <w:t>500)</w:t>
             </w:r>
           </w:p>
         </w:tc>
@@ -11367,6 +11483,7 @@
                 <w:szCs w:val="24"/>
               </w:rPr>
             </w:pPr>
+            <w:proofErr w:type="gramStart"/>
             <w:r>
               <w:rPr>
                 <w:sz w:val="24"/>
@@ -11374,6 +11491,7 @@
               </w:rPr>
               <w:t>VARCHAR(</w:t>
             </w:r>
+            <w:proofErr w:type="gramEnd"/>
             <w:r>
               <w:rPr>
                 <w:sz w:val="24"/>
@@ -11457,13 +11575,23 @@
                 <w:lang w:val="en-US"/>
               </w:rPr>
             </w:pPr>
+            <w:proofErr w:type="gramStart"/>
             <w:r>
               <w:rPr>
                 <w:sz w:val="24"/>
                 <w:szCs w:val="24"/>
                 <w:lang w:val="en-US"/>
               </w:rPr>
-              <w:t>VARCHAR(20)</w:t>
+              <w:t>VARCHAR(</w:t>
+            </w:r>
+            <w:proofErr w:type="gramEnd"/>
+            <w:r>
+              <w:rPr>
+                <w:sz w:val="24"/>
+                <w:szCs w:val="24"/>
+                <w:lang w:val="en-US"/>
+              </w:rPr>
+              <w:t>20)</w:t>
             </w:r>
           </w:p>
         </w:tc>
@@ -11623,13 +11751,23 @@
                 <w:szCs w:val="24"/>
               </w:rPr>
             </w:pPr>
+            <w:proofErr w:type="gramStart"/>
             <w:r>
               <w:rPr>
                 <w:sz w:val="24"/>
                 <w:szCs w:val="24"/>
                 <w:lang w:val="en-US"/>
               </w:rPr>
-              <w:t>VARCHAR(500)</w:t>
+              <w:t>VARCHAR(</w:t>
+            </w:r>
+            <w:proofErr w:type="gramEnd"/>
+            <w:r>
+              <w:rPr>
+                <w:sz w:val="24"/>
+                <w:szCs w:val="24"/>
+                <w:lang w:val="en-US"/>
+              </w:rPr>
+              <w:t>500)</w:t>
             </w:r>
           </w:p>
         </w:tc>
@@ -12303,13 +12441,23 @@
                 <w:lang w:val="en-US"/>
               </w:rPr>
             </w:pPr>
+            <w:proofErr w:type="gramStart"/>
             <w:r>
               <w:rPr>
                 <w:sz w:val="24"/>
                 <w:szCs w:val="24"/>
                 <w:lang w:val="en-US"/>
               </w:rPr>
-              <w:t>VARCHAR(10)</w:t>
+              <w:t>VARCHAR(</w:t>
+            </w:r>
+            <w:proofErr w:type="gramEnd"/>
+            <w:r>
+              <w:rPr>
+                <w:sz w:val="24"/>
+                <w:szCs w:val="24"/>
+                <w:lang w:val="en-US"/>
+              </w:rPr>
+              <w:t>10)</w:t>
             </w:r>
           </w:p>
         </w:tc>
@@ -12374,13 +12522,23 @@
                 <w:lang w:val="en-US"/>
               </w:rPr>
             </w:pPr>
+            <w:proofErr w:type="gramStart"/>
             <w:r>
               <w:rPr>
                 <w:sz w:val="24"/>
                 <w:szCs w:val="24"/>
                 <w:lang w:val="en-US"/>
               </w:rPr>
-              <w:t>VARCHAR(100)</w:t>
+              <w:t>VARCHAR(</w:t>
+            </w:r>
+            <w:proofErr w:type="gramEnd"/>
+            <w:r>
+              <w:rPr>
+                <w:sz w:val="24"/>
+                <w:szCs w:val="24"/>
+                <w:lang w:val="en-US"/>
+              </w:rPr>
+              <w:t>100)</w:t>
             </w:r>
           </w:p>
         </w:tc>
@@ -12549,53 +12707,14 @@
         </w:tc>
       </w:tr>
     </w:tbl>
+    <w:p/>
+    <w:p/>
+    <w:p/>
+    <w:p/>
+    <w:p/>
+    <w:p/>
     <w:p>
       <w:pPr>
-        <w:rPr>
-          <w:lang w:val="en-US"/>
-        </w:rPr>
-      </w:pPr>
-    </w:p>
-    <w:p>
-      <w:pPr>
-        <w:rPr>
-          <w:lang w:val="en-US"/>
-        </w:rPr>
-      </w:pPr>
-    </w:p>
-    <w:p>
-      <w:pPr>
-        <w:rPr>
-          <w:lang w:val="en-US"/>
-        </w:rPr>
-      </w:pPr>
-    </w:p>
-    <w:p>
-      <w:pPr>
-        <w:rPr>
-          <w:lang w:val="en-US"/>
-        </w:rPr>
-      </w:pPr>
-    </w:p>
-    <w:p>
-      <w:pPr>
-        <w:rPr>
-          <w:lang w:val="en-US"/>
-        </w:rPr>
-      </w:pPr>
-    </w:p>
-    <w:p>
-      <w:pPr>
-        <w:rPr>
-          <w:lang w:val="en-US"/>
-        </w:rPr>
-      </w:pPr>
-    </w:p>
-    <w:p>
-      <w:pPr>
-        <w:rPr>
-          <w:lang w:val="en-US"/>
-        </w:rPr>
         <w:sectPr>
           <w:pgSz w:w="11906" w:h="16838"/>
           <w:pgMar w:top="1134" w:right="567" w:bottom="851" w:left="1304" w:header="567" w:footer="567" w:gutter="0"/>
@@ -12614,7 +12733,6 @@
           <w:color w:val="auto"/>
           <w:sz w:val="28"/>
           <w:szCs w:val="28"/>
-          <w:lang w:val="en-US"/>
         </w:rPr>
       </w:pPr>
       <w:bookmarkStart w:id="12" w:name="_Toc228265546"/>
@@ -12632,34 +12750,10 @@
       </w:r>
       <w:bookmarkEnd w:id="12"/>
     </w:p>
-    <w:p>
-      <w:pPr>
-        <w:rPr>
-          <w:lang w:val="en-US"/>
-        </w:rPr>
-      </w:pPr>
-    </w:p>
-    <w:p>
-      <w:pPr>
-        <w:rPr>
-          <w:lang w:val="en-US"/>
-        </w:rPr>
-      </w:pPr>
-    </w:p>
-    <w:p>
-      <w:pPr>
-        <w:rPr>
-          <w:lang w:val="en-US"/>
-        </w:rPr>
-      </w:pPr>
-    </w:p>
-    <w:p>
-      <w:pPr>
-        <w:rPr>
-          <w:lang w:val="en-US"/>
-        </w:rPr>
-      </w:pPr>
-    </w:p>
+    <w:p/>
+    <w:p/>
+    <w:p/>
+    <w:p/>
     <w:p/>
     <w:p/>
     <w:p>
@@ -12682,7 +12776,6 @@
           <w:color w:val="auto"/>
           <w:sz w:val="28"/>
           <w:szCs w:val="28"/>
-          <w:lang w:val="en-US"/>
         </w:rPr>
       </w:pPr>
       <w:bookmarkStart w:id="13" w:name="_Toc228265547"/>
@@ -12700,53 +12793,14 @@
       </w:r>
       <w:bookmarkEnd w:id="13"/>
     </w:p>
+    <w:p/>
+    <w:p/>
+    <w:p/>
+    <w:p/>
+    <w:p/>
+    <w:p/>
     <w:p>
       <w:pPr>
-        <w:rPr>
-          <w:lang w:val="en-US"/>
-        </w:rPr>
-      </w:pPr>
-    </w:p>
-    <w:p>
-      <w:pPr>
-        <w:rPr>
-          <w:lang w:val="en-US"/>
-        </w:rPr>
-      </w:pPr>
-    </w:p>
-    <w:p>
-      <w:pPr>
-        <w:rPr>
-          <w:lang w:val="en-US"/>
-        </w:rPr>
-      </w:pPr>
-    </w:p>
-    <w:p>
-      <w:pPr>
-        <w:rPr>
-          <w:lang w:val="en-US"/>
-        </w:rPr>
-      </w:pPr>
-    </w:p>
-    <w:p>
-      <w:pPr>
-        <w:rPr>
-          <w:lang w:val="en-US"/>
-        </w:rPr>
-      </w:pPr>
-    </w:p>
-    <w:p>
-      <w:pPr>
-        <w:rPr>
-          <w:lang w:val="en-US"/>
-        </w:rPr>
-      </w:pPr>
-    </w:p>
-    <w:p>
-      <w:pPr>
-        <w:rPr>
-          <w:lang w:val="en-US"/>
-        </w:rPr>
         <w:sectPr>
           <w:pgSz w:w="11906" w:h="16838"/>
           <w:pgMar w:top="1134" w:right="567" w:bottom="851" w:left="1304" w:header="567" w:footer="567" w:gutter="0"/>
@@ -13656,8 +13710,8 @@
   <w:abstractNum w:abstractNumId="4" w15:restartNumberingAfterBreak="0">
     <w:nsid w:val="0A40607E"/>
     <w:multiLevelType w:val="hybridMultilevel"/>
-    <w:tmpl w:val="86640B94"/>
-    <w:lvl w:ilvl="0" w:tplc="6D363036">
+    <w:tmpl w:val="5DB0BCCC"/>
+    <w:lvl w:ilvl="0" w:tplc="52AE3C92">
       <w:start w:val="1"/>
       <w:numFmt w:val="decimal"/>
       <w:pStyle w:val="2"/>
@@ -16909,12 +16963,13 @@
     <w:link w:val="22"/>
     <w:autoRedefine/>
     <w:qFormat/>
-    <w:rsid w:val="00862CD4"/>
+    <w:rsid w:val="00563EE7"/>
     <w:pPr>
       <w:numPr>
         <w:numId w:val="13"/>
       </w:numPr>
       <w:spacing w:before="360" w:after="240"/>
+      <w:outlineLvl w:val="2"/>
     </w:pPr>
     <w:rPr>
       <w:rFonts w:ascii="Times New Roman" w:hAnsi="Times New Roman" w:cs="Times New Roman"/>
@@ -16929,7 +16984,7 @@
     <w:name w:val="(2)Подглава(бд) Знак"/>
     <w:basedOn w:val="21"/>
     <w:link w:val="2"/>
-    <w:rsid w:val="00862CD4"/>
+    <w:rsid w:val="00563EE7"/>
     <w:rPr>
       <w:rFonts w:asciiTheme="majorHAnsi" w:eastAsiaTheme="majorEastAsia" w:hAnsiTheme="majorHAnsi" w:cstheme="majorBidi"/>
       <w:b/>

</xml_diff>